<commit_message>
Add documentation and license files
</commit_message>
<xml_diff>
--- a/deliverables/Mini_AMR_Final_Report.docx
+++ b/deliverables/Mini_AMR_Final_Report.docx
@@ -19,7 +19,7 @@
           <w:bCs/>
           <w:sz w:val="30"/>
         </w:rPr>
-        <w:t>Final Project Report</w:t>
+        <w:t xml:space="preserve">Final Project Report: </w:t>
       </w:r>
       <w:r>
         <w:rPr>
@@ -28,7 +28,7 @@
           <w:bCs/>
           <w:sz w:val="30"/>
         </w:rPr>
-        <w:t xml:space="preserve">: </w:t>
+        <w:t>Mini</w:t>
       </w:r>
       <w:r>
         <w:rPr>
@@ -37,7 +37,7 @@
           <w:bCs/>
           <w:sz w:val="30"/>
         </w:rPr>
-        <w:t>Mini</w:t>
+        <w:t xml:space="preserve"> </w:t>
       </w:r>
       <w:r>
         <w:rPr>
@@ -46,21 +46,30 @@
           <w:bCs/>
           <w:sz w:val="30"/>
         </w:rPr>
-        <w:t xml:space="preserve"> </w:t>
-      </w:r>
-      <w:r>
+        <w:t>AMR ROS 2 Simulation Platform</w:t>
+      </w:r>
+    </w:p>
+    <w:p>
+      <w:pPr>
+        <w:jc w:val="center"/>
         <w:rPr>
           <w:rFonts w:ascii="Times New Roman" w:hAnsi="Times New Roman" w:cs="Times New Roman"/>
           <w:b/>
           <w:bCs/>
-          <w:sz w:val="30"/>
-        </w:rPr>
-        <w:t>AMR ROS 2 Simulation Platform</w:t>
-      </w:r>
-    </w:p>
-    <w:p>
-      <w:pPr>
-        <w:jc w:val="center"/>
+          <w:sz w:val="21"/>
+          <w:szCs w:val="21"/>
+        </w:rPr>
+      </w:pPr>
+    </w:p>
+    <w:p>
+      <w:pPr>
+        <w:rPr>
+          <w:rFonts w:ascii="Times New Roman" w:hAnsi="Times New Roman" w:cs="Times New Roman"/>
+          <w:sz w:val="21"/>
+          <w:szCs w:val="21"/>
+        </w:rPr>
+      </w:pPr>
+      <w:r>
         <w:rPr>
           <w:rFonts w:ascii="Times New Roman" w:hAnsi="Times New Roman" w:cs="Times New Roman"/>
           <w:b/>
@@ -68,7 +77,17 @@
           <w:sz w:val="21"/>
           <w:szCs w:val="21"/>
         </w:rPr>
-      </w:pPr>
+        <w:t>Project Title:</w:t>
+      </w:r>
+      <w:r>
+        <w:rPr>
+          <w:rFonts w:ascii="Times New Roman" w:hAnsi="Times New Roman" w:cs="Times New Roman"/>
+          <w:sz w:val="21"/>
+          <w:szCs w:val="21"/>
+        </w:rPr>
+        <w:br/>
+        <w:t>ROS 2 Based Mini Autonomous Mobile Robot (AMR) Simulation and Navigation Platform</w:t>
+      </w:r>
     </w:p>
     <w:p>
       <w:pPr>
@@ -86,7 +105,7 @@
           <w:sz w:val="21"/>
           <w:szCs w:val="21"/>
         </w:rPr>
-        <w:t>Project Title:</w:t>
+        <w:t>Development Environment:</w:t>
       </w:r>
       <w:r>
         <w:rPr>
@@ -95,7 +114,16 @@
           <w:szCs w:val="21"/>
         </w:rPr>
         <w:br/>
-        <w:t>ROS 2 Based Mini Autonomous Mobile Robot (AMR) Simulation and Navigation Platform</w:t>
+        <w:t>Ubuntu 24.04 LTS (WSL2)</w:t>
+      </w:r>
+      <w:r>
+        <w:rPr>
+          <w:rFonts w:ascii="Times New Roman" w:hAnsi="Times New Roman" w:cs="Times New Roman"/>
+          <w:sz w:val="21"/>
+          <w:szCs w:val="21"/>
+        </w:rPr>
+        <w:br/>
+        <w:t>ROS 2 Jazzy Jalisco</w:t>
       </w:r>
     </w:p>
     <w:p>
@@ -114,7 +142,7 @@
           <w:sz w:val="21"/>
           <w:szCs w:val="21"/>
         </w:rPr>
-        <w:t>Development Environment:</w:t>
+        <w:t>Project Period:</w:t>
       </w:r>
       <w:r>
         <w:rPr>
@@ -123,27 +151,80 @@
           <w:szCs w:val="21"/>
         </w:rPr>
         <w:br/>
-        <w:t>Ubuntu 24.04 LTS (WSL2)</w:t>
-      </w:r>
-      <w:r>
-        <w:rPr>
-          <w:rFonts w:ascii="Times New Roman" w:hAnsi="Times New Roman" w:cs="Times New Roman"/>
-          <w:sz w:val="21"/>
-          <w:szCs w:val="21"/>
-        </w:rPr>
-        <w:br/>
-        <w:t>ROS 2 Jazzy Jalisco</w:t>
-      </w:r>
-    </w:p>
-    <w:p>
-      <w:pPr>
-        <w:rPr>
-          <w:rFonts w:ascii="Times New Roman" w:hAnsi="Times New Roman" w:cs="Times New Roman"/>
-          <w:sz w:val="21"/>
-          <w:szCs w:val="21"/>
-        </w:rPr>
-      </w:pPr>
-      <w:r>
+        <w:t>June 9, 2026 – August 6, 2026</w:t>
+      </w:r>
+    </w:p>
+    <w:p>
+      <w:pPr>
+        <w:rPr>
+          <w:rFonts w:ascii="Times New Roman" w:hAnsi="Times New Roman" w:cs="Times New Roman"/>
+          <w:sz w:val="21"/>
+          <w:szCs w:val="21"/>
+        </w:rPr>
+      </w:pPr>
+    </w:p>
+    <w:p>
+      <w:pPr>
+        <w:rPr>
+          <w:rFonts w:ascii="Times New Roman" w:hAnsi="Times New Roman" w:cs="Times New Roman"/>
+          <w:sz w:val="21"/>
+          <w:szCs w:val="21"/>
+        </w:rPr>
+      </w:pPr>
+      <w:r>
+        <w:rPr>
+          <w:rFonts w:ascii="Times New Roman" w:hAnsi="Times New Roman" w:cs="Times New Roman"/>
+          <w:sz w:val="21"/>
+          <w:szCs w:val="21"/>
+        </w:rPr>
+        <w:t>This report presents the development of a ROS 2 based Mini-Autonomous Mobile Robot (AMR) simulation platform. The objective of this project is to study and implement the fundamental technologies required for autonomous mobile robots, including robot modeling, motion control, sensor processing, SLAM mapping, and autonomous navigation.</w:t>
+      </w:r>
+    </w:p>
+    <w:p>
+      <w:pPr>
+        <w:rPr>
+          <w:rFonts w:ascii="Times New Roman" w:hAnsi="Times New Roman" w:cs="Times New Roman"/>
+          <w:sz w:val="21"/>
+          <w:szCs w:val="21"/>
+        </w:rPr>
+      </w:pPr>
+      <w:r>
+        <w:rPr>
+          <w:rFonts w:ascii="Times New Roman" w:hAnsi="Times New Roman" w:cs="Times New Roman"/>
+          <w:sz w:val="21"/>
+          <w:szCs w:val="21"/>
+        </w:rPr>
+        <w:t>The system was developed using ROS 2 Jazzy on Ubuntu 24.04 and consists of five ROS 2 packages responsible for robot description, control, sensing, navigation, and system integration. A simulated LiDAR sensor and odometry system were implemented to enable mapping and autonomous navigation without physical hardware.</w:t>
+      </w:r>
+    </w:p>
+    <w:p>
+      <w:pPr>
+        <w:rPr>
+          <w:rFonts w:ascii="Times New Roman" w:hAnsi="Times New Roman" w:cs="Times New Roman"/>
+          <w:sz w:val="21"/>
+          <w:szCs w:val="21"/>
+        </w:rPr>
+      </w:pPr>
+      <w:r>
+        <w:rPr>
+          <w:rFonts w:ascii="Times New Roman" w:hAnsi="Times New Roman" w:cs="Times New Roman"/>
+          <w:sz w:val="21"/>
+          <w:szCs w:val="21"/>
+        </w:rPr>
+        <w:t>The final system successfully performed map-based autonomous navigation using the ROS 2 Navigation2 framework. Experimental results showed that the robot reached the target position with a position error of approximately 4.2 cm, demonstrating the effectiveness of the developed Mini-AMR platform.</w:t>
+      </w:r>
+    </w:p>
+    <w:p>
+      <w:pPr>
+        <w:rPr>
+          <w:rFonts w:ascii="Times New Roman" w:hAnsi="Times New Roman" w:cs="Times New Roman"/>
+          <w:sz w:val="21"/>
+          <w:szCs w:val="21"/>
+        </w:rPr>
+      </w:pPr>
+    </w:p>
+    <w:p>
+      <w:pPr>
         <w:rPr>
           <w:rFonts w:ascii="Times New Roman" w:hAnsi="Times New Roman" w:cs="Times New Roman"/>
           <w:b/>
@@ -151,89 +232,8 @@
           <w:sz w:val="21"/>
           <w:szCs w:val="21"/>
         </w:rPr>
-        <w:t>Project Period:</w:t>
-      </w:r>
-      <w:r>
-        <w:rPr>
-          <w:rFonts w:ascii="Times New Roman" w:hAnsi="Times New Roman" w:cs="Times New Roman"/>
-          <w:sz w:val="21"/>
-          <w:szCs w:val="21"/>
-        </w:rPr>
-        <w:br/>
-        <w:t>June 9, 2026 – August 6, 2026</w:t>
-      </w:r>
-    </w:p>
-    <w:p>
-      <w:pPr>
-        <w:rPr>
-          <w:rFonts w:ascii="Times New Roman" w:hAnsi="Times New Roman" w:cs="Times New Roman"/>
-          <w:sz w:val="21"/>
-          <w:szCs w:val="21"/>
-        </w:rPr>
-      </w:pPr>
-    </w:p>
-    <w:p>
-      <w:pPr>
-        <w:rPr>
-          <w:rFonts w:ascii="Times New Roman" w:hAnsi="Times New Roman" w:cs="Times New Roman"/>
-          <w:sz w:val="21"/>
-          <w:szCs w:val="21"/>
-        </w:rPr>
-      </w:pPr>
-      <w:r>
-        <w:rPr>
-          <w:rFonts w:ascii="Times New Roman" w:hAnsi="Times New Roman" w:cs="Times New Roman"/>
-          <w:sz w:val="21"/>
-          <w:szCs w:val="21"/>
-        </w:rPr>
-        <w:t>This report presents the development of a ROS 2 based Mini-Autonomous Mobile Robot (AMR) simulation platform. The objective of this project is to study and implement the fundamental technologies required for autonomous mobile robots, including robot modeling, motion control, sensor processing, SLAM mapping, and autonomous navigation.</w:t>
-      </w:r>
-    </w:p>
-    <w:p>
-      <w:pPr>
-        <w:rPr>
-          <w:rFonts w:ascii="Times New Roman" w:hAnsi="Times New Roman" w:cs="Times New Roman"/>
-          <w:sz w:val="21"/>
-          <w:szCs w:val="21"/>
-        </w:rPr>
-      </w:pPr>
-      <w:r>
-        <w:rPr>
-          <w:rFonts w:ascii="Times New Roman" w:hAnsi="Times New Roman" w:cs="Times New Roman"/>
-          <w:sz w:val="21"/>
-          <w:szCs w:val="21"/>
-        </w:rPr>
-        <w:t>The system was developed using ROS 2 Jazzy on Ubuntu 24.04 and consists of five ROS 2 packages responsible for robot description, control, sensing, navigation, and system integration. A simulated LiDAR sensor and odometry system were implemented to enable mapping and autonomous navigation without physical hardware.</w:t>
-      </w:r>
-    </w:p>
-    <w:p>
-      <w:pPr>
-        <w:rPr>
-          <w:rFonts w:ascii="Times New Roman" w:hAnsi="Times New Roman" w:cs="Times New Roman"/>
-          <w:sz w:val="21"/>
-          <w:szCs w:val="21"/>
-        </w:rPr>
-      </w:pPr>
-      <w:r>
-        <w:rPr>
-          <w:rFonts w:ascii="Times New Roman" w:hAnsi="Times New Roman" w:cs="Times New Roman"/>
-          <w:sz w:val="21"/>
-          <w:szCs w:val="21"/>
-        </w:rPr>
-        <w:t>The final system successfully performed map-based autonomous navigation using the ROS 2 Navigation2 framework. Experimental results showed that the robot reached the target position with a position error of approximately 4.2 cm, demonstrating the effectiveness of the developed Mini-AMR platform.</w:t>
-      </w:r>
-    </w:p>
-    <w:p>
-      <w:pPr>
-        <w:rPr>
-          <w:rFonts w:ascii="Times New Roman" w:hAnsi="Times New Roman" w:cs="Times New Roman"/>
-          <w:sz w:val="21"/>
-          <w:szCs w:val="21"/>
-        </w:rPr>
-      </w:pPr>
-    </w:p>
-    <w:p>
-      <w:pPr>
+      </w:pPr>
+      <w:r>
         <w:rPr>
           <w:rFonts w:ascii="Times New Roman" w:hAnsi="Times New Roman" w:cs="Times New Roman"/>
           <w:b/>
@@ -241,15 +241,6 @@
           <w:sz w:val="21"/>
           <w:szCs w:val="21"/>
         </w:rPr>
-      </w:pPr>
-      <w:r>
-        <w:rPr>
-          <w:rFonts w:ascii="Times New Roman" w:hAnsi="Times New Roman" w:cs="Times New Roman"/>
-          <w:b/>
-          <w:bCs/>
-          <w:sz w:val="21"/>
-          <w:szCs w:val="21"/>
-        </w:rPr>
         <w:t>1. Introduction</w:t>
       </w:r>
     </w:p>
@@ -284,25 +275,7 @@
           <w:sz w:val="21"/>
           <w:szCs w:val="21"/>
         </w:rPr>
-        <w:t>The objective of this project is to develop a complete software-based AMR system without requiring physical robot hardware. The developed platform includes a robot model created using URDF/</w:t>
-      </w:r>
-      <w:proofErr w:type="spellStart"/>
-      <w:r>
-        <w:rPr>
-          <w:rFonts w:ascii="Times New Roman" w:hAnsi="Times New Roman" w:cs="Times New Roman"/>
-          <w:sz w:val="21"/>
-          <w:szCs w:val="21"/>
-        </w:rPr>
-        <w:t>Xacro</w:t>
-      </w:r>
-      <w:proofErr w:type="spellEnd"/>
-      <w:r>
-        <w:rPr>
-          <w:rFonts w:ascii="Times New Roman" w:hAnsi="Times New Roman" w:cs="Times New Roman"/>
-          <w:sz w:val="21"/>
-          <w:szCs w:val="21"/>
-        </w:rPr>
-        <w:t>, velocity control through ROS 2 communication interfaces, simulated LiDAR sensing, SLAM mapping, and autonomous navigation using the Navigation2 (Nav2) framework.</w:t>
+        <w:t>The objective of this project is to develop a complete software-based AMR system without requiring physical robot hardware. The developed platform includes a robot model created using URDF/Xacro, velocity control through ROS 2 communication interfaces, simulated LiDAR sensing, SLAM mapping, and autonomous navigation using the Navigation2 (Nav2) framework.</w:t>
       </w:r>
     </w:p>
     <w:p>
@@ -477,7 +450,6 @@
                 <w:szCs w:val="21"/>
               </w:rPr>
             </w:pPr>
-            <w:proofErr w:type="spellStart"/>
             <w:r>
               <w:rPr>
                 <w:rFonts w:ascii="Times New Roman" w:hAnsi="Times New Roman" w:cs="Times New Roman"/>
@@ -486,7 +458,6 @@
               </w:rPr>
               <w:t>mini_amr_description</w:t>
             </w:r>
-            <w:proofErr w:type="spellEnd"/>
           </w:p>
         </w:tc>
         <w:tc>
@@ -509,25 +480,7 @@
                 <w:sz w:val="21"/>
                 <w:szCs w:val="21"/>
               </w:rPr>
-              <w:t>Robot model, URDF/</w:t>
-            </w:r>
-            <w:proofErr w:type="spellStart"/>
-            <w:r>
-              <w:rPr>
-                <w:rFonts w:ascii="Times New Roman" w:hAnsi="Times New Roman" w:cs="Times New Roman"/>
-                <w:sz w:val="21"/>
-                <w:szCs w:val="21"/>
-              </w:rPr>
-              <w:t>Xacro</w:t>
-            </w:r>
-            <w:proofErr w:type="spellEnd"/>
-            <w:r>
-              <w:rPr>
-                <w:rFonts w:ascii="Times New Roman" w:hAnsi="Times New Roman" w:cs="Times New Roman"/>
-                <w:sz w:val="21"/>
-                <w:szCs w:val="21"/>
-              </w:rPr>
-              <w:t>, and RViz visualization</w:t>
+              <w:t>Robot model, URDF/Xacro, and RViz visualization</w:t>
             </w:r>
           </w:p>
         </w:tc>
@@ -550,7 +503,6 @@
                 <w:szCs w:val="21"/>
               </w:rPr>
             </w:pPr>
-            <w:proofErr w:type="spellStart"/>
             <w:r>
               <w:rPr>
                 <w:rFonts w:ascii="Times New Roman" w:hAnsi="Times New Roman" w:cs="Times New Roman"/>
@@ -559,7 +511,6 @@
               </w:rPr>
               <w:t>mini_amr_control</w:t>
             </w:r>
-            <w:proofErr w:type="spellEnd"/>
           </w:p>
         </w:tc>
         <w:tc>
@@ -605,7 +556,6 @@
                 <w:szCs w:val="21"/>
               </w:rPr>
             </w:pPr>
-            <w:proofErr w:type="spellStart"/>
             <w:r>
               <w:rPr>
                 <w:rFonts w:ascii="Times New Roman" w:hAnsi="Times New Roman" w:cs="Times New Roman"/>
@@ -614,7 +564,6 @@
               </w:rPr>
               <w:t>mini_amr_sensors</w:t>
             </w:r>
-            <w:proofErr w:type="spellEnd"/>
           </w:p>
         </w:tc>
         <w:tc>
@@ -660,7 +609,6 @@
                 <w:szCs w:val="21"/>
               </w:rPr>
             </w:pPr>
-            <w:proofErr w:type="spellStart"/>
             <w:r>
               <w:rPr>
                 <w:rFonts w:ascii="Times New Roman" w:hAnsi="Times New Roman" w:cs="Times New Roman"/>
@@ -669,7 +617,6 @@
               </w:rPr>
               <w:t>mini_amr_navigation</w:t>
             </w:r>
-            <w:proofErr w:type="spellEnd"/>
           </w:p>
         </w:tc>
         <w:tc>
@@ -715,7 +662,6 @@
                 <w:szCs w:val="21"/>
               </w:rPr>
             </w:pPr>
-            <w:proofErr w:type="spellStart"/>
             <w:r>
               <w:rPr>
                 <w:rFonts w:ascii="Times New Roman" w:hAnsi="Times New Roman" w:cs="Times New Roman"/>
@@ -724,7 +670,6 @@
               </w:rPr>
               <w:t>mini_amr_bringup</w:t>
             </w:r>
-            <w:proofErr w:type="spellEnd"/>
           </w:p>
         </w:tc>
         <w:tc>
@@ -814,43 +759,7 @@
           <w:sz w:val="21"/>
           <w:szCs w:val="21"/>
         </w:rPr>
-        <w:t>The system is divided into several functional layers. The control layer receives velocity commands from either teleoperation or the Nav2 controller through the /</w:t>
-      </w:r>
-      <w:proofErr w:type="spellStart"/>
-      <w:r>
-        <w:rPr>
-          <w:rFonts w:ascii="Times New Roman" w:hAnsi="Times New Roman" w:cs="Times New Roman"/>
-          <w:sz w:val="21"/>
-          <w:szCs w:val="21"/>
-        </w:rPr>
-        <w:t>cmd_vel</w:t>
-      </w:r>
-      <w:proofErr w:type="spellEnd"/>
-      <w:r>
-        <w:rPr>
-          <w:rFonts w:ascii="Times New Roman" w:hAnsi="Times New Roman" w:cs="Times New Roman"/>
-          <w:sz w:val="21"/>
-          <w:szCs w:val="21"/>
-        </w:rPr>
-        <w:t xml:space="preserve"> interface. The motion control and odometry modules process these commands to estimate robot movement and publish odometry information through the /</w:t>
-      </w:r>
-      <w:proofErr w:type="spellStart"/>
-      <w:r>
-        <w:rPr>
-          <w:rFonts w:ascii="Times New Roman" w:hAnsi="Times New Roman" w:cs="Times New Roman"/>
-          <w:sz w:val="21"/>
-          <w:szCs w:val="21"/>
-        </w:rPr>
-        <w:t>odom</w:t>
-      </w:r>
-      <w:proofErr w:type="spellEnd"/>
-      <w:r>
-        <w:rPr>
-          <w:rFonts w:ascii="Times New Roman" w:hAnsi="Times New Roman" w:cs="Times New Roman"/>
-          <w:sz w:val="21"/>
-          <w:szCs w:val="21"/>
-        </w:rPr>
-        <w:t xml:space="preserve"> topic and TF transformation system.</w:t>
+        <w:t>The system is divided into several functional layers. The control layer receives velocity commands from either teleoperation or the Nav2 controller through the /cmd_vel interface. The motion control and odometry modules process these commands to estimate robot movement and publish odometry information through the /odom topic and TF transformation system.</w:t>
       </w:r>
     </w:p>
     <w:p>
@@ -1059,7 +968,6 @@
           <w:szCs w:val="21"/>
         </w:rPr>
       </w:pPr>
-      <w:proofErr w:type="spellStart"/>
       <w:r>
         <w:rPr>
           <w:rFonts w:ascii="Times New Roman" w:hAnsi="Times New Roman" w:cs="Times New Roman"/>
@@ -1068,7 +976,6 @@
         </w:rPr>
         <w:t>odom</w:t>
       </w:r>
-      <w:proofErr w:type="spellEnd"/>
     </w:p>
     <w:p>
       <w:pPr>
@@ -1115,7 +1022,6 @@
           <w:szCs w:val="21"/>
         </w:rPr>
       </w:pPr>
-      <w:proofErr w:type="spellStart"/>
       <w:r>
         <w:rPr>
           <w:rFonts w:ascii="Times New Roman" w:hAnsi="Times New Roman" w:cs="Times New Roman"/>
@@ -1124,7 +1030,6 @@
         </w:rPr>
         <w:t>base_footprint</w:t>
       </w:r>
-      <w:proofErr w:type="spellEnd"/>
     </w:p>
     <w:p>
       <w:pPr>
@@ -1171,7 +1076,6 @@
           <w:szCs w:val="21"/>
         </w:rPr>
       </w:pPr>
-      <w:proofErr w:type="spellStart"/>
       <w:r>
         <w:rPr>
           <w:rFonts w:ascii="Times New Roman" w:hAnsi="Times New Roman" w:cs="Times New Roman"/>
@@ -1180,7 +1084,6 @@
         </w:rPr>
         <w:t>base_link</w:t>
       </w:r>
-      <w:proofErr w:type="spellEnd"/>
     </w:p>
     <w:p>
       <w:pPr>
@@ -1233,36 +1136,8 @@
           <w:sz w:val="21"/>
           <w:szCs w:val="21"/>
         </w:rPr>
-        <w:t xml:space="preserve">wheels   </w:t>
-      </w:r>
-      <w:proofErr w:type="spellStart"/>
-      <w:r>
-        <w:rPr>
-          <w:rFonts w:ascii="Times New Roman" w:hAnsi="Times New Roman" w:cs="Times New Roman"/>
-          <w:sz w:val="21"/>
-          <w:szCs w:val="21"/>
-        </w:rPr>
-        <w:t>wheels</w:t>
-      </w:r>
-      <w:proofErr w:type="spellEnd"/>
-      <w:r>
-        <w:rPr>
-          <w:rFonts w:ascii="Times New Roman" w:hAnsi="Times New Roman" w:cs="Times New Roman"/>
-          <w:sz w:val="21"/>
-          <w:szCs w:val="21"/>
-        </w:rPr>
-        <w:t xml:space="preserve">   </w:t>
-      </w:r>
-      <w:proofErr w:type="spellStart"/>
-      <w:r>
-        <w:rPr>
-          <w:rFonts w:ascii="Times New Roman" w:hAnsi="Times New Roman" w:cs="Times New Roman"/>
-          <w:sz w:val="21"/>
-          <w:szCs w:val="21"/>
-        </w:rPr>
-        <w:t>laser_link</w:t>
-      </w:r>
-      <w:proofErr w:type="spellEnd"/>
+        <w:t>wheels   wheels   laser_link</w:t>
+      </w:r>
     </w:p>
     <w:p>
       <w:pPr>
@@ -1279,23 +1154,7 @@
           <w:sz w:val="21"/>
           <w:szCs w:val="21"/>
         </w:rPr>
-        <w:t xml:space="preserve">Figure </w:t>
-      </w:r>
-      <w:r>
-        <w:rPr>
-          <w:rFonts w:ascii="Times New Roman" w:hAnsi="Times New Roman" w:cs="Times New Roman"/>
-          <w:sz w:val="21"/>
-          <w:szCs w:val="21"/>
-        </w:rPr>
-        <w:t>1</w:t>
-      </w:r>
-      <w:r>
-        <w:rPr>
-          <w:rFonts w:ascii="Times New Roman" w:hAnsi="Times New Roman" w:cs="Times New Roman"/>
-          <w:sz w:val="21"/>
-          <w:szCs w:val="21"/>
-        </w:rPr>
-        <w:t>. TF coordinate structure of the Mini-AMR ROS 2 system</w:t>
+        <w:t>Figure 1. TF coordinate structure of the Mini-AMR ROS 2 system</w:t>
       </w:r>
     </w:p>
     <w:tbl>
@@ -1446,7 +1305,6 @@
                 <w:szCs w:val="21"/>
               </w:rPr>
             </w:pPr>
-            <w:proofErr w:type="spellStart"/>
             <w:r>
               <w:rPr>
                 <w:rFonts w:ascii="Times New Roman" w:hAnsi="Times New Roman" w:cs="Times New Roman"/>
@@ -1455,7 +1313,6 @@
               </w:rPr>
               <w:t>odom</w:t>
             </w:r>
-            <w:proofErr w:type="spellEnd"/>
           </w:p>
         </w:tc>
         <w:tc>
@@ -1503,7 +1360,6 @@
                 <w:szCs w:val="21"/>
               </w:rPr>
             </w:pPr>
-            <w:proofErr w:type="spellStart"/>
             <w:r>
               <w:rPr>
                 <w:rFonts w:ascii="Times New Roman" w:hAnsi="Times New Roman" w:cs="Times New Roman"/>
@@ -1512,7 +1368,6 @@
               </w:rPr>
               <w:t>base_footprint</w:t>
             </w:r>
-            <w:proofErr w:type="spellEnd"/>
           </w:p>
         </w:tc>
         <w:tc>
@@ -1560,7 +1415,6 @@
                 <w:szCs w:val="21"/>
               </w:rPr>
             </w:pPr>
-            <w:proofErr w:type="spellStart"/>
             <w:r>
               <w:rPr>
                 <w:rFonts w:ascii="Times New Roman" w:hAnsi="Times New Roman" w:cs="Times New Roman"/>
@@ -1569,7 +1423,6 @@
               </w:rPr>
               <w:t>base_link</w:t>
             </w:r>
-            <w:proofErr w:type="spellEnd"/>
           </w:p>
         </w:tc>
         <w:tc>
@@ -1617,7 +1470,6 @@
                 <w:szCs w:val="21"/>
               </w:rPr>
             </w:pPr>
-            <w:proofErr w:type="spellStart"/>
             <w:r>
               <w:rPr>
                 <w:rFonts w:ascii="Times New Roman" w:hAnsi="Times New Roman" w:cs="Times New Roman"/>
@@ -1626,7 +1478,6 @@
               </w:rPr>
               <w:t>laser_link</w:t>
             </w:r>
-            <w:proofErr w:type="spellEnd"/>
           </w:p>
         </w:tc>
         <w:tc>
@@ -1749,41 +1600,13 @@
           <w:szCs w:val="21"/>
         </w:rPr>
       </w:pPr>
-      <w:proofErr w:type="spellStart"/>
-      <w:r>
-        <w:rPr>
-          <w:rFonts w:ascii="Times New Roman" w:hAnsi="Times New Roman" w:cs="Times New Roman"/>
-          <w:sz w:val="21"/>
-          <w:szCs w:val="21"/>
-        </w:rPr>
-        <w:t>odom</w:t>
-      </w:r>
-      <w:proofErr w:type="spellEnd"/>
-      <w:r>
-        <w:rPr>
-          <w:rFonts w:ascii="Times New Roman" w:hAnsi="Times New Roman" w:cs="Times New Roman"/>
-          <w:sz w:val="21"/>
-          <w:szCs w:val="21"/>
-        </w:rPr>
-        <w:t xml:space="preserve"> → </w:t>
-      </w:r>
-      <w:proofErr w:type="spellStart"/>
-      <w:r>
-        <w:rPr>
-          <w:rFonts w:ascii="Times New Roman" w:hAnsi="Times New Roman" w:cs="Times New Roman"/>
-          <w:sz w:val="21"/>
-          <w:szCs w:val="21"/>
-        </w:rPr>
-        <w:t>base_footprint</w:t>
-      </w:r>
-      <w:proofErr w:type="spellEnd"/>
-      <w:r>
-        <w:rPr>
-          <w:rFonts w:ascii="Times New Roman" w:hAnsi="Times New Roman" w:cs="Times New Roman"/>
-          <w:sz w:val="21"/>
-          <w:szCs w:val="21"/>
-        </w:rPr>
-        <w:t xml:space="preserve"> is provided by the odometry node to represent robot movement. </w:t>
+      <w:r>
+        <w:rPr>
+          <w:rFonts w:ascii="Times New Roman" w:hAnsi="Times New Roman" w:cs="Times New Roman"/>
+          <w:sz w:val="21"/>
+          <w:szCs w:val="21"/>
+        </w:rPr>
+        <w:t xml:space="preserve">odom → base_footprint is provided by the odometry node to represent robot movement. </w:t>
       </w:r>
     </w:p>
     <w:p>
@@ -1798,41 +1621,13 @@
           <w:szCs w:val="21"/>
         </w:rPr>
       </w:pPr>
-      <w:proofErr w:type="spellStart"/>
-      <w:r>
-        <w:rPr>
-          <w:rFonts w:ascii="Times New Roman" w:hAnsi="Times New Roman" w:cs="Times New Roman"/>
-          <w:sz w:val="21"/>
-          <w:szCs w:val="21"/>
-        </w:rPr>
-        <w:t>base_footprint</w:t>
-      </w:r>
-      <w:proofErr w:type="spellEnd"/>
-      <w:r>
-        <w:rPr>
-          <w:rFonts w:ascii="Times New Roman" w:hAnsi="Times New Roman" w:cs="Times New Roman"/>
-          <w:sz w:val="21"/>
-          <w:szCs w:val="21"/>
-        </w:rPr>
-        <w:t xml:space="preserve"> → </w:t>
-      </w:r>
-      <w:proofErr w:type="spellStart"/>
-      <w:r>
-        <w:rPr>
-          <w:rFonts w:ascii="Times New Roman" w:hAnsi="Times New Roman" w:cs="Times New Roman"/>
-          <w:sz w:val="21"/>
-          <w:szCs w:val="21"/>
-        </w:rPr>
-        <w:t>base_link</w:t>
-      </w:r>
-      <w:proofErr w:type="spellEnd"/>
-      <w:r>
-        <w:rPr>
-          <w:rFonts w:ascii="Times New Roman" w:hAnsi="Times New Roman" w:cs="Times New Roman"/>
-          <w:sz w:val="21"/>
-          <w:szCs w:val="21"/>
-        </w:rPr>
-        <w:t xml:space="preserve"> is defined by the robot URDF model. </w:t>
+      <w:r>
+        <w:rPr>
+          <w:rFonts w:ascii="Times New Roman" w:hAnsi="Times New Roman" w:cs="Times New Roman"/>
+          <w:sz w:val="21"/>
+          <w:szCs w:val="21"/>
+        </w:rPr>
+        <w:t xml:space="preserve">base_footprint → base_link is defined by the robot URDF model. </w:t>
       </w:r>
     </w:p>
     <w:p>
@@ -1847,41 +1642,13 @@
           <w:szCs w:val="21"/>
         </w:rPr>
       </w:pPr>
-      <w:proofErr w:type="spellStart"/>
-      <w:r>
-        <w:rPr>
-          <w:rFonts w:ascii="Times New Roman" w:hAnsi="Times New Roman" w:cs="Times New Roman"/>
-          <w:sz w:val="21"/>
-          <w:szCs w:val="21"/>
-        </w:rPr>
-        <w:t>base_link</w:t>
-      </w:r>
-      <w:proofErr w:type="spellEnd"/>
-      <w:r>
-        <w:rPr>
-          <w:rFonts w:ascii="Times New Roman" w:hAnsi="Times New Roman" w:cs="Times New Roman"/>
-          <w:sz w:val="21"/>
-          <w:szCs w:val="21"/>
-        </w:rPr>
-        <w:t xml:space="preserve"> → </w:t>
-      </w:r>
-      <w:proofErr w:type="spellStart"/>
-      <w:r>
-        <w:rPr>
-          <w:rFonts w:ascii="Times New Roman" w:hAnsi="Times New Roman" w:cs="Times New Roman"/>
-          <w:sz w:val="21"/>
-          <w:szCs w:val="21"/>
-        </w:rPr>
-        <w:t>laser_link</w:t>
-      </w:r>
-      <w:proofErr w:type="spellEnd"/>
-      <w:r>
-        <w:rPr>
-          <w:rFonts w:ascii="Times New Roman" w:hAnsi="Times New Roman" w:cs="Times New Roman"/>
-          <w:sz w:val="21"/>
-          <w:szCs w:val="21"/>
-        </w:rPr>
-        <w:t xml:space="preserve"> allows LiDAR data to be correctly transformed into the robot coordinate system. </w:t>
+      <w:r>
+        <w:rPr>
+          <w:rFonts w:ascii="Times New Roman" w:hAnsi="Times New Roman" w:cs="Times New Roman"/>
+          <w:sz w:val="21"/>
+          <w:szCs w:val="21"/>
+        </w:rPr>
+        <w:t xml:space="preserve">base_link → laser_link allows LiDAR data to be correctly transformed into the robot coordinate system. </w:t>
       </w:r>
     </w:p>
     <w:p>
@@ -1902,25 +1669,7 @@
           <w:sz w:val="21"/>
           <w:szCs w:val="21"/>
         </w:rPr>
-        <w:t xml:space="preserve">map → </w:t>
-      </w:r>
-      <w:proofErr w:type="spellStart"/>
-      <w:r>
-        <w:rPr>
-          <w:rFonts w:ascii="Times New Roman" w:hAnsi="Times New Roman" w:cs="Times New Roman"/>
-          <w:sz w:val="21"/>
-          <w:szCs w:val="21"/>
-        </w:rPr>
-        <w:t>odom</w:t>
-      </w:r>
-      <w:proofErr w:type="spellEnd"/>
-      <w:r>
-        <w:rPr>
-          <w:rFonts w:ascii="Times New Roman" w:hAnsi="Times New Roman" w:cs="Times New Roman"/>
-          <w:sz w:val="21"/>
-          <w:szCs w:val="21"/>
-        </w:rPr>
-        <w:t xml:space="preserve"> is generated by SLAM Toolbox during mapping or AMCL during autonomous navigation. </w:t>
+        <w:t xml:space="preserve">map → odom is generated by SLAM Toolbox during mapping or AMCL during autonomous navigation. </w:t>
       </w:r>
     </w:p>
     <w:p>
@@ -2040,28 +1789,8 @@
                 <w:sz w:val="21"/>
                 <w:szCs w:val="21"/>
               </w:rPr>
-              <w:t>/</w:t>
+              <w:t>/cmd_vel</w:t>
             </w:r>
-            <w:proofErr w:type="spellStart"/>
-            <w:proofErr w:type="gramStart"/>
-            <w:r>
-              <w:rPr>
-                <w:rFonts w:ascii="Times New Roman" w:hAnsi="Times New Roman" w:cs="Times New Roman"/>
-                <w:sz w:val="21"/>
-                <w:szCs w:val="21"/>
-              </w:rPr>
-              <w:t>cmd</w:t>
-            </w:r>
-            <w:proofErr w:type="gramEnd"/>
-            <w:r>
-              <w:rPr>
-                <w:rFonts w:ascii="Times New Roman" w:hAnsi="Times New Roman" w:cs="Times New Roman"/>
-                <w:sz w:val="21"/>
-                <w:szCs w:val="21"/>
-              </w:rPr>
-              <w:t>_vel</w:t>
-            </w:r>
-            <w:proofErr w:type="spellEnd"/>
           </w:p>
         </w:tc>
         <w:tc>
@@ -2115,20 +1844,8 @@
                 <w:sz w:val="21"/>
                 <w:szCs w:val="21"/>
               </w:rPr>
-              <w:t>/</w:t>
+              <w:t>/odom</w:t>
             </w:r>
-            <w:proofErr w:type="spellStart"/>
-            <w:proofErr w:type="gramStart"/>
-            <w:r>
-              <w:rPr>
-                <w:rFonts w:ascii="Times New Roman" w:hAnsi="Times New Roman" w:cs="Times New Roman"/>
-                <w:sz w:val="21"/>
-                <w:szCs w:val="21"/>
-              </w:rPr>
-              <w:t>odom</w:t>
-            </w:r>
-            <w:proofErr w:type="spellEnd"/>
-            <w:proofErr w:type="gramEnd"/>
           </w:p>
         </w:tc>
         <w:tc>
@@ -2182,18 +1899,8 @@
                 <w:sz w:val="21"/>
                 <w:szCs w:val="21"/>
               </w:rPr>
-              <w:t>/</w:t>
+              <w:t>/scan</w:t>
             </w:r>
-            <w:proofErr w:type="gramStart"/>
-            <w:r>
-              <w:rPr>
-                <w:rFonts w:ascii="Times New Roman" w:hAnsi="Times New Roman" w:cs="Times New Roman"/>
-                <w:sz w:val="21"/>
-                <w:szCs w:val="21"/>
-              </w:rPr>
-              <w:t>scan</w:t>
-            </w:r>
-            <w:proofErr w:type="gramEnd"/>
           </w:p>
         </w:tc>
         <w:tc>
@@ -2247,18 +1954,8 @@
                 <w:sz w:val="21"/>
                 <w:szCs w:val="21"/>
               </w:rPr>
-              <w:t>/</w:t>
+              <w:t>/map</w:t>
             </w:r>
-            <w:proofErr w:type="gramStart"/>
-            <w:r>
-              <w:rPr>
-                <w:rFonts w:ascii="Times New Roman" w:hAnsi="Times New Roman" w:cs="Times New Roman"/>
-                <w:sz w:val="21"/>
-                <w:szCs w:val="21"/>
-              </w:rPr>
-              <w:t>map</w:t>
-            </w:r>
-            <w:proofErr w:type="gramEnd"/>
           </w:p>
         </w:tc>
         <w:tc>
@@ -2312,20 +2009,8 @@
                 <w:sz w:val="21"/>
                 <w:szCs w:val="21"/>
               </w:rPr>
-              <w:t>/</w:t>
+              <w:t>/initialpose</w:t>
             </w:r>
-            <w:proofErr w:type="spellStart"/>
-            <w:proofErr w:type="gramStart"/>
-            <w:r>
-              <w:rPr>
-                <w:rFonts w:ascii="Times New Roman" w:hAnsi="Times New Roman" w:cs="Times New Roman"/>
-                <w:sz w:val="21"/>
-                <w:szCs w:val="21"/>
-              </w:rPr>
-              <w:t>initialpose</w:t>
-            </w:r>
-            <w:proofErr w:type="spellEnd"/>
-            <w:proofErr w:type="gramEnd"/>
           </w:p>
         </w:tc>
         <w:tc>
@@ -2379,28 +2064,8 @@
                 <w:sz w:val="21"/>
                 <w:szCs w:val="21"/>
               </w:rPr>
-              <w:t>/</w:t>
+              <w:t>/navigate_to_pose</w:t>
             </w:r>
-            <w:proofErr w:type="spellStart"/>
-            <w:proofErr w:type="gramStart"/>
-            <w:r>
-              <w:rPr>
-                <w:rFonts w:ascii="Times New Roman" w:hAnsi="Times New Roman" w:cs="Times New Roman"/>
-                <w:sz w:val="21"/>
-                <w:szCs w:val="21"/>
-              </w:rPr>
-              <w:t>navigate</w:t>
-            </w:r>
-            <w:proofErr w:type="gramEnd"/>
-            <w:r>
-              <w:rPr>
-                <w:rFonts w:ascii="Times New Roman" w:hAnsi="Times New Roman" w:cs="Times New Roman"/>
-                <w:sz w:val="21"/>
-                <w:szCs w:val="21"/>
-              </w:rPr>
-              <w:t>_to_pose</w:t>
-            </w:r>
-            <w:proofErr w:type="spellEnd"/>
           </w:p>
         </w:tc>
         <w:tc>
@@ -2454,28 +2119,8 @@
                 <w:sz w:val="21"/>
                 <w:szCs w:val="21"/>
               </w:rPr>
-              <w:t>/</w:t>
+              <w:t>/safety_markers</w:t>
             </w:r>
-            <w:proofErr w:type="spellStart"/>
-            <w:proofErr w:type="gramStart"/>
-            <w:r>
-              <w:rPr>
-                <w:rFonts w:ascii="Times New Roman" w:hAnsi="Times New Roman" w:cs="Times New Roman"/>
-                <w:sz w:val="21"/>
-                <w:szCs w:val="21"/>
-              </w:rPr>
-              <w:t>safety</w:t>
-            </w:r>
-            <w:proofErr w:type="gramEnd"/>
-            <w:r>
-              <w:rPr>
-                <w:rFonts w:ascii="Times New Roman" w:hAnsi="Times New Roman" w:cs="Times New Roman"/>
-                <w:sz w:val="21"/>
-                <w:szCs w:val="21"/>
-              </w:rPr>
-              <w:t>_markers</w:t>
-            </w:r>
-            <w:proofErr w:type="spellEnd"/>
           </w:p>
         </w:tc>
         <w:tc>
@@ -2561,25 +2206,7 @@
           <w:sz w:val="21"/>
           <w:szCs w:val="21"/>
         </w:rPr>
-        <w:t>The robot model was created using URDF/</w:t>
-      </w:r>
-      <w:proofErr w:type="spellStart"/>
-      <w:r>
-        <w:rPr>
-          <w:rFonts w:ascii="Times New Roman" w:hAnsi="Times New Roman" w:cs="Times New Roman"/>
-          <w:sz w:val="21"/>
-          <w:szCs w:val="21"/>
-        </w:rPr>
-        <w:t>Xacro</w:t>
-      </w:r>
-      <w:proofErr w:type="spellEnd"/>
-      <w:r>
-        <w:rPr>
-          <w:rFonts w:ascii="Times New Roman" w:hAnsi="Times New Roman" w:cs="Times New Roman"/>
-          <w:sz w:val="21"/>
-          <w:szCs w:val="21"/>
-        </w:rPr>
-        <w:t>. The model consists of:</w:t>
+        <w:t>The robot model was created using URDF/Xacro. The model consists of:</w:t>
       </w:r>
     </w:p>
     <w:p>
@@ -2600,25 +2227,7 @@
           <w:sz w:val="21"/>
           <w:szCs w:val="21"/>
         </w:rPr>
-        <w:t>A main robot body (</w:t>
-      </w:r>
-      <w:proofErr w:type="spellStart"/>
-      <w:r>
-        <w:rPr>
-          <w:rFonts w:ascii="Times New Roman" w:hAnsi="Times New Roman" w:cs="Times New Roman"/>
-          <w:sz w:val="21"/>
-          <w:szCs w:val="21"/>
-        </w:rPr>
-        <w:t>base_link</w:t>
-      </w:r>
-      <w:proofErr w:type="spellEnd"/>
-      <w:r>
-        <w:rPr>
-          <w:rFonts w:ascii="Times New Roman" w:hAnsi="Times New Roman" w:cs="Times New Roman"/>
-          <w:sz w:val="21"/>
-          <w:szCs w:val="21"/>
-        </w:rPr>
-        <w:t xml:space="preserve">) </w:t>
+        <w:t xml:space="preserve">A main robot body (base_link) </w:t>
       </w:r>
     </w:p>
     <w:p>
@@ -2633,23 +2242,13 @@
           <w:szCs w:val="21"/>
         </w:rPr>
       </w:pPr>
-      <w:proofErr w:type="gramStart"/>
-      <w:r>
-        <w:rPr>
-          <w:rFonts w:ascii="Times New Roman" w:hAnsi="Times New Roman" w:cs="Times New Roman"/>
-          <w:sz w:val="21"/>
-          <w:szCs w:val="21"/>
-        </w:rPr>
-        <w:t>Four wheel</w:t>
-      </w:r>
-      <w:proofErr w:type="gramEnd"/>
-      <w:r>
-        <w:rPr>
-          <w:rFonts w:ascii="Times New Roman" w:hAnsi="Times New Roman" w:cs="Times New Roman"/>
-          <w:sz w:val="21"/>
-          <w:szCs w:val="21"/>
-        </w:rPr>
-        <w:t xml:space="preserve"> components </w:t>
+      <w:r>
+        <w:rPr>
+          <w:rFonts w:ascii="Times New Roman" w:hAnsi="Times New Roman" w:cs="Times New Roman"/>
+          <w:sz w:val="21"/>
+          <w:szCs w:val="21"/>
+        </w:rPr>
+        <w:t xml:space="preserve">Four wheel components </w:t>
       </w:r>
     </w:p>
     <w:p>
@@ -2670,25 +2269,7 @@
           <w:sz w:val="21"/>
           <w:szCs w:val="21"/>
         </w:rPr>
-        <w:t>A LiDAR sensor frame (</w:t>
-      </w:r>
-      <w:proofErr w:type="spellStart"/>
-      <w:r>
-        <w:rPr>
-          <w:rFonts w:ascii="Times New Roman" w:hAnsi="Times New Roman" w:cs="Times New Roman"/>
-          <w:sz w:val="21"/>
-          <w:szCs w:val="21"/>
-        </w:rPr>
-        <w:t>laser_link</w:t>
-      </w:r>
-      <w:proofErr w:type="spellEnd"/>
-      <w:r>
-        <w:rPr>
-          <w:rFonts w:ascii="Times New Roman" w:hAnsi="Times New Roman" w:cs="Times New Roman"/>
-          <w:sz w:val="21"/>
-          <w:szCs w:val="21"/>
-        </w:rPr>
-        <w:t xml:space="preserve">) </w:t>
+        <w:t xml:space="preserve">A LiDAR sensor frame (laser_link) </w:t>
       </w:r>
     </w:p>
     <w:p>
@@ -2867,25 +2448,7 @@
           <w:sz w:val="21"/>
           <w:szCs w:val="21"/>
         </w:rPr>
-        <w:t>The /</w:t>
-      </w:r>
-      <w:proofErr w:type="spellStart"/>
-      <w:r>
-        <w:rPr>
-          <w:rFonts w:ascii="Times New Roman" w:hAnsi="Times New Roman" w:cs="Times New Roman"/>
-          <w:sz w:val="21"/>
-          <w:szCs w:val="21"/>
-        </w:rPr>
-        <w:t>cmd_vel</w:t>
-      </w:r>
-      <w:proofErr w:type="spellEnd"/>
-      <w:r>
-        <w:rPr>
-          <w:rFonts w:ascii="Times New Roman" w:hAnsi="Times New Roman" w:cs="Times New Roman"/>
-          <w:sz w:val="21"/>
-          <w:szCs w:val="21"/>
-        </w:rPr>
-        <w:t xml:space="preserve"> topic is used as the main control interface, where linear and angular velocities are transmitted to the robot control system.</w:t>
+        <w:t>The /cmd_vel topic is used as the main control interface, where linear and angular velocities are transmitted to the robot control system.</w:t>
       </w:r>
     </w:p>
     <w:p>
@@ -2923,27 +2486,7 @@
           <w:sz w:val="21"/>
           <w:szCs w:val="21"/>
         </w:rPr>
-        <w:t>/</w:t>
-      </w:r>
-      <w:proofErr w:type="spellStart"/>
-      <w:proofErr w:type="gramStart"/>
-      <w:r>
-        <w:rPr>
-          <w:rFonts w:ascii="Times New Roman" w:hAnsi="Times New Roman" w:cs="Times New Roman"/>
-          <w:sz w:val="21"/>
-          <w:szCs w:val="21"/>
-        </w:rPr>
-        <w:t>odom</w:t>
-      </w:r>
-      <w:proofErr w:type="spellEnd"/>
-      <w:proofErr w:type="gramEnd"/>
-      <w:r>
-        <w:rPr>
-          <w:rFonts w:ascii="Times New Roman" w:hAnsi="Times New Roman" w:cs="Times New Roman"/>
-          <w:sz w:val="21"/>
-          <w:szCs w:val="21"/>
-        </w:rPr>
-        <w:t xml:space="preserve"> topic </w:t>
+        <w:t xml:space="preserve">/odom topic </w:t>
       </w:r>
     </w:p>
     <w:p>
@@ -2958,41 +2501,13 @@
           <w:szCs w:val="21"/>
         </w:rPr>
       </w:pPr>
-      <w:proofErr w:type="spellStart"/>
-      <w:r>
-        <w:rPr>
-          <w:rFonts w:ascii="Times New Roman" w:hAnsi="Times New Roman" w:cs="Times New Roman"/>
-          <w:sz w:val="21"/>
-          <w:szCs w:val="21"/>
-        </w:rPr>
-        <w:t>odom</w:t>
-      </w:r>
-      <w:proofErr w:type="spellEnd"/>
-      <w:r>
-        <w:rPr>
-          <w:rFonts w:ascii="Times New Roman" w:hAnsi="Times New Roman" w:cs="Times New Roman"/>
-          <w:sz w:val="21"/>
-          <w:szCs w:val="21"/>
-        </w:rPr>
-        <w:t xml:space="preserve"> → </w:t>
-      </w:r>
-      <w:proofErr w:type="spellStart"/>
-      <w:r>
-        <w:rPr>
-          <w:rFonts w:ascii="Times New Roman" w:hAnsi="Times New Roman" w:cs="Times New Roman"/>
-          <w:sz w:val="21"/>
-          <w:szCs w:val="21"/>
-        </w:rPr>
-        <w:t>base_footprint</w:t>
-      </w:r>
-      <w:proofErr w:type="spellEnd"/>
-      <w:r>
-        <w:rPr>
-          <w:rFonts w:ascii="Times New Roman" w:hAnsi="Times New Roman" w:cs="Times New Roman"/>
-          <w:sz w:val="21"/>
-          <w:szCs w:val="21"/>
-        </w:rPr>
-        <w:t xml:space="preserve"> TF transformation </w:t>
+      <w:r>
+        <w:rPr>
+          <w:rFonts w:ascii="Times New Roman" w:hAnsi="Times New Roman" w:cs="Times New Roman"/>
+          <w:sz w:val="21"/>
+          <w:szCs w:val="21"/>
+        </w:rPr>
+        <w:t xml:space="preserve">odom → base_footprint TF transformation </w:t>
       </w:r>
     </w:p>
     <w:p>
@@ -3026,25 +2541,7 @@
           <w:sz w:val="21"/>
           <w:szCs w:val="21"/>
         </w:rPr>
-        <w:t xml:space="preserve">A </w:t>
-      </w:r>
-      <w:proofErr w:type="spellStart"/>
-      <w:r>
-        <w:rPr>
-          <w:rFonts w:ascii="Times New Roman" w:hAnsi="Times New Roman" w:cs="Times New Roman"/>
-          <w:sz w:val="21"/>
-          <w:szCs w:val="21"/>
-        </w:rPr>
-        <w:t>mecanum</w:t>
-      </w:r>
-      <w:proofErr w:type="spellEnd"/>
-      <w:r>
-        <w:rPr>
-          <w:rFonts w:ascii="Times New Roman" w:hAnsi="Times New Roman" w:cs="Times New Roman"/>
-          <w:sz w:val="21"/>
-          <w:szCs w:val="21"/>
-        </w:rPr>
-        <w:t xml:space="preserve"> wheel kinematic model was also developed to analyze omni-directional robot motion and calculate individual wheel velocities.</w:t>
+        <w:t>A mecanum wheel kinematic model was also developed to analyze omni-directional robot motion and calculate individual wheel velocities.</w:t>
       </w:r>
       <w:r>
         <w:rPr>
@@ -3107,25 +2604,7 @@
           <w:sz w:val="21"/>
           <w:szCs w:val="21"/>
         </w:rPr>
-        <w:t xml:space="preserve">A simulated 2D LiDAR sensor was developed to provide </w:t>
-      </w:r>
-      <w:proofErr w:type="spellStart"/>
-      <w:r>
-        <w:rPr>
-          <w:rFonts w:ascii="Times New Roman" w:hAnsi="Times New Roman" w:cs="Times New Roman"/>
-          <w:sz w:val="21"/>
-          <w:szCs w:val="21"/>
-        </w:rPr>
-        <w:t>LaserScan</w:t>
-      </w:r>
-      <w:proofErr w:type="spellEnd"/>
-      <w:r>
-        <w:rPr>
-          <w:rFonts w:ascii="Times New Roman" w:hAnsi="Times New Roman" w:cs="Times New Roman"/>
-          <w:sz w:val="21"/>
-          <w:szCs w:val="21"/>
-        </w:rPr>
-        <w:t xml:space="preserve"> data through the /scan topic.</w:t>
+        <w:t>A simulated 2D LiDAR sensor was developed to provide LaserScan data through the /scan topic.</w:t>
       </w:r>
     </w:p>
     <w:p>
@@ -3505,23 +2984,7 @@
           <w:sz w:val="21"/>
           <w:szCs w:val="21"/>
         </w:rPr>
-        <w:t xml:space="preserve">Figure </w:t>
-      </w:r>
-      <w:r>
-        <w:rPr>
-          <w:rFonts w:ascii="Times New Roman" w:hAnsi="Times New Roman" w:cs="Times New Roman"/>
-          <w:sz w:val="21"/>
-          <w:szCs w:val="21"/>
-        </w:rPr>
-        <w:t>3</w:t>
-      </w:r>
-      <w:r>
-        <w:rPr>
-          <w:rFonts w:ascii="Times New Roman" w:hAnsi="Times New Roman" w:cs="Times New Roman"/>
-          <w:sz w:val="21"/>
-          <w:szCs w:val="21"/>
-        </w:rPr>
-        <w:t>. Occupancy grid map generated using SLAM Toolbox</w:t>
+        <w:t>Figure 3. Occupancy grid map generated using SLAM Toolbox</w:t>
       </w:r>
     </w:p>
     <w:p>
@@ -3709,7 +3172,6 @@
         </w:rPr>
         <w:t xml:space="preserve">The robot receives a navigation goal through RViz2 and calculates a collision-free path using the </w:t>
       </w:r>
-      <w:proofErr w:type="gramStart"/>
       <w:r>
         <w:rPr>
           <w:rFonts w:ascii="Times New Roman" w:hAnsi="Times New Roman" w:cs="Times New Roman"/>
@@ -3718,7 +3180,6 @@
         </w:rPr>
         <w:t>generated map</w:t>
       </w:r>
-      <w:proofErr w:type="gramEnd"/>
       <w:r>
         <w:rPr>
           <w:rFonts w:ascii="Times New Roman" w:hAnsi="Times New Roman" w:cs="Times New Roman"/>
@@ -3802,7 +3263,9 @@
           <w:szCs w:val="21"/>
         </w:rPr>
       </w:pPr>
-      <w:r>
+    </w:p>
+    <w:p>
+      <w:pPr>
         <w:rPr>
           <w:rFonts w:ascii="Times New Roman" w:hAnsi="Times New Roman" w:cs="Times New Roman"/>
           <w:b/>
@@ -3810,6 +3273,16 @@
           <w:sz w:val="21"/>
           <w:szCs w:val="21"/>
         </w:rPr>
+      </w:pPr>
+      <w:r>
+        <w:rPr>
+          <w:rFonts w:ascii="Times New Roman" w:hAnsi="Times New Roman" w:cs="Times New Roman"/>
+          <w:b/>
+          <w:bCs/>
+          <w:sz w:val="21"/>
+          <w:szCs w:val="21"/>
+        </w:rPr>
+        <w:lastRenderedPageBreak/>
         <w:t xml:space="preserve">4.1 </w:t>
       </w:r>
       <w:r>
@@ -3862,7 +3335,6 @@
                 <w:sz w:val="21"/>
                 <w:szCs w:val="21"/>
               </w:rPr>
-              <w:lastRenderedPageBreak/>
               <w:t>Parameter</w:t>
             </w:r>
           </w:p>
@@ -4182,7 +3654,7 @@
     <w:p>
       <w:pPr>
         <w:rPr>
-          <w:rFonts w:ascii="Times New Roman" w:hAnsi="Times New Roman" w:hint="cs"/>
+          <w:rFonts w:ascii="Times New Roman" w:hAnsi="Times New Roman"/>
           <w:sz w:val="21"/>
           <w:szCs w:val="21"/>
           <w:cs/>
@@ -4305,7 +3777,7 @@
           <w:numId w:val="14"/>
         </w:numPr>
         <w:rPr>
-          <w:rFonts w:ascii="Times New Roman" w:hAnsi="Times New Roman" w:hint="cs"/>
+          <w:rFonts w:ascii="Times New Roman" w:hAnsi="Times New Roman"/>
           <w:sz w:val="21"/>
           <w:szCs w:val="21"/>
           <w:cs/>
@@ -4341,7 +3813,7 @@
       <w:pPr>
         <w:jc w:val="center"/>
         <w:rPr>
-          <w:rFonts w:ascii="Times New Roman" w:hAnsi="Times New Roman" w:hint="cs"/>
+          <w:rFonts w:ascii="Times New Roman" w:hAnsi="Times New Roman"/>
           <w:sz w:val="21"/>
           <w:szCs w:val="21"/>
         </w:rPr>
@@ -4428,46 +3900,7 @@
           <w:sz w:val="21"/>
           <w:szCs w:val="21"/>
         </w:rPr>
-        <w:t xml:space="preserve">. Autonomous navigation </w:t>
-      </w:r>
-      <w:proofErr w:type="gramStart"/>
-      <w:r>
-        <w:rPr>
-          <w:rFonts w:ascii="Times New Roman" w:hAnsi="Times New Roman" w:cs="Times New Roman"/>
-          <w:sz w:val="21"/>
-          <w:szCs w:val="21"/>
-        </w:rPr>
-        <w:t>result</w:t>
-      </w:r>
-      <w:proofErr w:type="gramEnd"/>
-      <w:r>
-        <w:rPr>
-          <w:rFonts w:ascii="Times New Roman" w:hAnsi="Times New Roman" w:cs="Times New Roman"/>
-          <w:sz w:val="21"/>
-          <w:szCs w:val="21"/>
-        </w:rPr>
-        <w:t xml:space="preserve"> using the Nav2 framework.</w:t>
-      </w:r>
-    </w:p>
-    <w:p>
-      <w:pPr>
-        <w:rPr>
-          <w:rFonts w:ascii="Times New Roman" w:hAnsi="Times New Roman" w:cs="Times New Roman"/>
-          <w:b/>
-          <w:bCs/>
-          <w:sz w:val="21"/>
-          <w:szCs w:val="21"/>
-        </w:rPr>
-      </w:pPr>
-      <w:r>
-        <w:rPr>
-          <w:rFonts w:ascii="Times New Roman" w:hAnsi="Times New Roman" w:cs="Times New Roman"/>
-          <w:b/>
-          <w:bCs/>
-          <w:sz w:val="21"/>
-          <w:szCs w:val="21"/>
-        </w:rPr>
-        <w:br w:type="page"/>
+        <w:t>. Autonomous navigation result using the Nav2 framework.</w:t>
       </w:r>
     </w:p>
     <w:p>
@@ -4831,7 +4264,7 @@
     <w:p>
       <w:pPr>
         <w:rPr>
-          <w:rFonts w:ascii="Times New Roman" w:hAnsi="Times New Roman" w:hint="cs"/>
+          <w:rFonts w:ascii="Times New Roman" w:hAnsi="Times New Roman"/>
           <w:sz w:val="21"/>
           <w:szCs w:val="21"/>
         </w:rPr>
@@ -4853,7 +4286,7 @@
           <w:szCs w:val="21"/>
         </w:rPr>
         <w:drawing>
-          <wp:inline distT="0" distB="0" distL="0" distR="0" wp14:anchorId="07202D93" wp14:editId="5DFA5581">
+          <wp:inline distT="0" distB="0" distL="0" distR="0" wp14:anchorId="07202D93" wp14:editId="5C9B2617">
             <wp:extent cx="3956364" cy="3956364"/>
             <wp:effectExtent l="0" t="0" r="6350" b="6350"/>
             <wp:docPr id="1322840579" name="Picture 4"/>
@@ -4940,7 +4373,7 @@
     <w:p>
       <w:pPr>
         <w:rPr>
-          <w:rFonts w:ascii="Times New Roman" w:hAnsi="Times New Roman" w:cs="Times New Roman" w:hint="cs"/>
+          <w:rFonts w:ascii="Times New Roman" w:hAnsi="Times New Roman" w:cs="Times New Roman"/>
           <w:b/>
           <w:bCs/>
           <w:sz w:val="21"/>
@@ -4979,7 +4412,7 @@
     <w:p>
       <w:pPr>
         <w:rPr>
-          <w:rFonts w:ascii="Times New Roman" w:hAnsi="Times New Roman" w:hint="cs"/>
+          <w:rFonts w:ascii="Times New Roman" w:hAnsi="Times New Roman"/>
           <w:sz w:val="21"/>
           <w:szCs w:val="21"/>
           <w:cs/>
@@ -5243,7 +4676,7 @@
           <w:numId w:val="8"/>
         </w:numPr>
         <w:rPr>
-          <w:rFonts w:ascii="Times New Roman" w:hAnsi="Times New Roman" w:cs="Times New Roman" w:hint="cs"/>
+          <w:rFonts w:ascii="Times New Roman" w:hAnsi="Times New Roman" w:cs="Times New Roman"/>
           <w:sz w:val="21"/>
           <w:szCs w:val="21"/>
         </w:rPr>
@@ -8053,6 +7486,7 @@
   <w:style w:type="character" w:default="1" w:styleId="DefaultParagraphFont">
     <w:name w:val="Default Paragraph Font"/>
     <w:uiPriority w:val="1"/>
+    <w:semiHidden/>
     <w:unhideWhenUsed/>
   </w:style>
   <w:style w:type="table" w:default="1" w:styleId="TableNormal">

</xml_diff>